<commit_message>
Replace licensed-translation scraper with public-domain fixtures
get_scripture.py no longer scrapes a licensed translation with a spoofed
browser agent. The demo now ships verbatim World English Bible text
(public domain) in scripture_fixtures.json, loaded locally; the module
docstring states the two rules that hold in demo and production alike:
scripture never passes through a language model, and text rights are
respected. Sample .docx regenerated with the public-domain text; the
demo now runs fully offline. README updated to match, bs4 dependency
dropped, prose cleaned of em-dashes.

Text rights are data handling too.

Co-Authored-By: Claude Fable 5 <noreply@anthropic.com>
</commit_message>
<xml_diff>
--- a/Worship Plans/worship_plan_2026_07_19_SEVENTHSUNDAYA.docx
+++ b/Worship Plans/worship_plan_2026_07_19_SEVENTHSUNDAYA.docx
@@ -28,7 +28,7 @@
         <w:rPr>
           <w:i/>
         </w:rPr>
-        <w:t>Theme: The Good Soil — patience, rootedness, and what grows unseen</w:t>
+        <w:t>Theme: The Good Soil; patience, rootedness, and what grows unseen</w:t>
       </w:r>
     </w:p>
     <w:p/>
@@ -474,7 +474,7 @@
         <w:rPr>
           <w:b/>
         </w:rPr>
-        <w:t>First Reading: Isaiah 55:10-13</w:t>
+        <w:t>First Reading: Isaiah 55:10-13 (World English Bible, public domain)</w:t>
       </w:r>
     </w:p>
     <w:p>
@@ -493,7 +493,7 @@
         <w:ind w:left="720"/>
       </w:pPr>
       <w:r>
-        <w:t>For as the rain and the snow come down from heaven and do not return there until they have watered the earth, making it bring forth and sprout, giving seed to the sower and bread to the eater, so shall my word be that goes out from my mouth; it shall not return to me empty, but it shall accomplish that which I purpose and succeed in the thing for which I sent it. For you shall go out in joy and be led back in peace; the mountains and the hills before you shall burst into song, and all the trees of the field shall clap their hands. Instead of the thorn shall come up the cypress; instead of the brier shall come up the myrtle, and it shall be to the Lord for a memorial, for an everlasting sign that shall not be cut off.</w:t>
+        <w:t>For as the rain comes down and the snow from the sky, and doesn't return there, but waters the earth, and makes it grow and bud, and gives seed to the sower and bread to the eater; so is my word that goes out of my mouth: it will not return to me void, but it will accomplish that which I please, and it will prosper in the thing I sent it to do.</w:t>
       </w:r>
     </w:p>
     <w:p>
@@ -501,27 +501,7 @@
         <w:ind w:left="720"/>
       </w:pPr>
       <w:r>
-        <w:rPr>
-          <w:i/>
-        </w:rPr>
-        <w:t>The word of the Lord.</w:t>
-      </w:r>
-      <w:r>
-        <w:br/>
-      </w:r>
-      <w:r>
-        <w:rPr>
-          <w:b/>
-        </w:rPr>
-        <w:t>Thanks be to God.</w:t>
-      </w:r>
-    </w:p>
-    <w:p>
-      <w:r>
-        <w:rPr>
-          <w:b/>
-        </w:rPr>
-        <w:t>Gospel Acclamation:</w:t>
+        <w:t>For you shall go out with joy, and be led out with peace. The mountains and the hills will break out before you into singing; and all the trees of the fields will clap their hands. Instead of the thorn the cypress tree will come up; and instead of the brier the myrtle tree will come up: and it will make a name for Yahweh, for an everlasting sign that will not be cut off.</w:t>
       </w:r>
     </w:p>
     <w:p>
@@ -532,6 +512,34 @@
         <w:rPr>
           <w:i/>
         </w:rPr>
+        <w:t>The word of the Lord.</w:t>
+      </w:r>
+      <w:r>
+        <w:br/>
+      </w:r>
+      <w:r>
+        <w:rPr>
+          <w:b/>
+        </w:rPr>
+        <w:t>Thanks be to God.</w:t>
+      </w:r>
+    </w:p>
+    <w:p>
+      <w:r>
+        <w:rPr>
+          <w:b/>
+        </w:rPr>
+        <w:t>Gospel Acclamation:</w:t>
+      </w:r>
+    </w:p>
+    <w:p>
+      <w:pPr>
+        <w:ind w:left="720"/>
+      </w:pPr>
+      <w:r>
+        <w:rPr>
+          <w:i/>
+        </w:rPr>
         <w:t>Alleluia round the Table (301)</w:t>
       </w:r>
     </w:p>
@@ -548,7 +556,7 @@
         <w:rPr>
           <w:b/>
         </w:rPr>
-        <w:t>Gospel: Matthew 13:1-9, 18-23</w:t>
+        <w:t>Gospel: Matthew 13:1-9 (World English Bible, public domain)</w:t>
       </w:r>
     </w:p>
     <w:p>
@@ -578,7 +586,7 @@
         <w:ind w:left="720"/>
       </w:pPr>
       <w:r>
-        <w:t>That same day Jesus went out of the house and sat beside the sea. Such great crowds gathered around him that he got into a boat and sat there, while the whole crowd stood on the beach. And he told them many things in parables, saying: “Listen! A sower went out to sow. And as he sowed, some seeds fell on a path, and the birds came and ate them up. Other seeds fell on rocky ground, where they did not have much soil, and they sprang up quickly, since they had no depth of soil. But when the sun rose, they were scorched, and since they had no root, they withered away. Other seeds fell among thorns, and the thorns grew up and choked them. Other seeds fell on good soil and brought forth grain, some a hundredfold, some sixty, some thirty. If you have ears, hear!” … “Hear, then, the parable of the sower. When anyone hears the word of the kingdom and does not understand it, the evil one comes and snatches away what is sown in the heart; this is what was sown on the path. As for what was sown on rocky ground, this is the one who hears the word and immediately receives it with joy, yet such a person has no root but endures only for a while, and when trouble or persecution arises on account of the word, that person immediately falls away. As for what was sown among thorns, this is the one who hears the word, but the cares of this age and the lure of wealth choke the word, and it yields nothing. But as for what was sown on good soil, this is the one who hears the word and understands it, who indeed bears fruit and yields in one case a hundredfold, in another sixty, and in another thirty.”</w:t>
+        <w:t>On that day Jesus went out of the house, and sat by the seaside. Great multitudes gathered to him, so that he entered into a boat, and sat, and all the multitude stood on the beach. He spoke to them many things in parables, saying, "Behold, a farmer went out to sow. As he sowed, some seeds fell by the roadside, and the birds came and devoured them. Others fell on rocky ground, where they didn't have much soil, and immediately they sprang up, because they had no depth of earth. When the sun had risen, they were scorched. Because they had no root, they withered away. Others fell among thorns. The thorns grew up and choked them. Others fell on good soil, and yielded fruit: some one hundred times as much, some sixty, and some thirty. He who has ears to hear, let him hear."</w:t>
       </w:r>
     </w:p>
     <w:p>

</xml_diff>